<commit_message>
refactor(logic): clean up dead code, optimize camera histories, and enhance documentation
- Removed obsolete single-camera radius depth baseline logic.
</commit_message>
<xml_diff>
--- a/explenations.docx
+++ b/explenations.docx
@@ -6716,335 +6716,467 @@
     <w:p>
       <w:pPr>
         <w:rPr>
+          <w:b/>
+          <w:bCs/>
+          <w:rtl/>
+        </w:rPr>
+      </w:pPr>
+      <w:r>
+        <w:rPr>
+          <w:rFonts w:cs="Arial" w:hint="cs"/>
+          <w:b/>
+          <w:bCs/>
+          <w:rtl/>
+        </w:rPr>
+        <w:t>אם</w:t>
+      </w:r>
+      <w:r>
+        <w:rPr>
+          <w:rFonts w:cs="Arial"/>
+          <w:b/>
+          <w:bCs/>
+          <w:rtl/>
+        </w:rPr>
+        <w:t xml:space="preserve"> </w:t>
+      </w:r>
+      <w:r>
+        <w:rPr>
+          <w:rFonts w:cs="Arial" w:hint="cs"/>
+          <w:b/>
+          <w:bCs/>
+          <w:rtl/>
+        </w:rPr>
+        <w:t>הכדור</w:t>
+      </w:r>
+      <w:r>
+        <w:rPr>
+          <w:rFonts w:cs="Arial"/>
+          <w:b/>
+          <w:bCs/>
+          <w:rtl/>
+        </w:rPr>
+        <w:t xml:space="preserve"> </w:t>
+      </w:r>
+      <w:r>
+        <w:rPr>
+          <w:rFonts w:cs="Arial" w:hint="cs"/>
+          <w:b/>
+          <w:bCs/>
+          <w:rtl/>
+        </w:rPr>
+        <w:t>נופל</w:t>
+      </w:r>
+      <w:r>
+        <w:rPr>
+          <w:rFonts w:cs="Arial"/>
+          <w:b/>
+          <w:bCs/>
+          <w:rtl/>
+        </w:rPr>
+        <w:t xml:space="preserve"> </w:t>
+      </w:r>
+      <w:r>
+        <w:rPr>
+          <w:rFonts w:cs="Arial" w:hint="cs"/>
+          <w:b/>
+          <w:bCs/>
+          <w:rtl/>
+        </w:rPr>
+        <w:t>לרצפה</w:t>
+      </w:r>
+      <w:r>
+        <w:rPr>
+          <w:rFonts w:cs="Arial"/>
+          <w:b/>
+          <w:bCs/>
+          <w:rtl/>
+        </w:rPr>
+        <w:t xml:space="preserve"> </w:t>
+      </w:r>
+      <w:r>
+        <w:rPr>
+          <w:rFonts w:cs="Arial" w:hint="cs"/>
+          <w:b/>
+          <w:bCs/>
+          <w:rtl/>
+        </w:rPr>
+        <w:t>והמשחק</w:t>
+      </w:r>
+      <w:r>
+        <w:rPr>
+          <w:rFonts w:cs="Arial"/>
+          <w:b/>
+          <w:bCs/>
+          <w:rtl/>
+        </w:rPr>
+        <w:t xml:space="preserve"> </w:t>
+      </w:r>
+      <w:r>
+        <w:rPr>
+          <w:rFonts w:cs="Arial" w:hint="cs"/>
+          <w:b/>
+          <w:bCs/>
+          <w:rtl/>
+        </w:rPr>
+        <w:t>ממשיך</w:t>
+      </w:r>
+      <w:r>
+        <w:rPr>
+          <w:rFonts w:cs="Arial"/>
+          <w:b/>
+          <w:bCs/>
+          <w:rtl/>
+        </w:rPr>
+        <w:t xml:space="preserve"> </w:t>
+      </w:r>
+      <w:r>
+        <w:rPr>
+          <w:rFonts w:cs="Arial" w:hint="cs"/>
+          <w:b/>
+          <w:bCs/>
+          <w:rtl/>
+        </w:rPr>
+        <w:t>כאילו</w:t>
+      </w:r>
+      <w:r>
+        <w:rPr>
+          <w:rFonts w:cs="Arial"/>
+          <w:b/>
+          <w:bCs/>
+          <w:rtl/>
+        </w:rPr>
+        <w:t xml:space="preserve"> </w:t>
+      </w:r>
+      <w:r>
+        <w:rPr>
+          <w:rFonts w:cs="Arial" w:hint="cs"/>
+          <w:b/>
+          <w:bCs/>
+          <w:rtl/>
+        </w:rPr>
+        <w:t>כלום</w:t>
+      </w:r>
+      <w:r>
+        <w:rPr>
+          <w:rFonts w:cs="Arial"/>
+          <w:b/>
+          <w:bCs/>
+          <w:rtl/>
+        </w:rPr>
+        <w:t xml:space="preserve"> </w:t>
+      </w:r>
+      <w:r>
+        <w:rPr>
+          <w:rFonts w:cs="Arial" w:hint="cs"/>
+          <w:b/>
+          <w:bCs/>
+          <w:rtl/>
+        </w:rPr>
+        <w:t>לא</w:t>
+      </w:r>
+      <w:r>
+        <w:rPr>
+          <w:rFonts w:cs="Arial"/>
+          <w:b/>
+          <w:bCs/>
+          <w:rtl/>
+        </w:rPr>
+        <w:t xml:space="preserve"> </w:t>
+      </w:r>
+      <w:r>
+        <w:rPr>
+          <w:rFonts w:cs="Arial" w:hint="cs"/>
+          <w:b/>
+          <w:bCs/>
+          <w:rtl/>
+        </w:rPr>
+        <w:t>קרה</w:t>
+      </w:r>
+      <w:r>
+        <w:rPr>
+          <w:rFonts w:cs="Arial"/>
+          <w:b/>
+          <w:bCs/>
+          <w:rtl/>
+        </w:rPr>
+        <w:t xml:space="preserve"> -&gt; </w:t>
+      </w:r>
+      <w:r>
+        <w:rPr>
+          <w:rFonts w:cs="Arial" w:hint="cs"/>
+          <w:b/>
+          <w:bCs/>
+          <w:rtl/>
+        </w:rPr>
+        <w:t>סימן</w:t>
+      </w:r>
+      <w:r>
+        <w:rPr>
+          <w:rFonts w:cs="Arial"/>
+          <w:b/>
+          <w:bCs/>
+          <w:rtl/>
+        </w:rPr>
+        <w:t xml:space="preserve"> </w:t>
+      </w:r>
+      <w:r>
+        <w:rPr>
+          <w:rFonts w:cs="Arial" w:hint="cs"/>
+          <w:b/>
+          <w:bCs/>
+          <w:rtl/>
+        </w:rPr>
+        <w:t>שהאפסילון</w:t>
+      </w:r>
+      <w:r>
+        <w:rPr>
+          <w:rFonts w:cs="Arial"/>
+          <w:b/>
+          <w:bCs/>
+          <w:rtl/>
+        </w:rPr>
+        <w:t xml:space="preserve"> </w:t>
+      </w:r>
+      <w:r>
+        <w:rPr>
+          <w:rFonts w:cs="Arial" w:hint="cs"/>
+          <w:b/>
+          <w:bCs/>
+          <w:rtl/>
+        </w:rPr>
+        <w:t>קטן</w:t>
+      </w:r>
+      <w:r>
+        <w:rPr>
+          <w:rFonts w:cs="Arial"/>
+          <w:b/>
+          <w:bCs/>
+          <w:rtl/>
+        </w:rPr>
+        <w:t xml:space="preserve"> </w:t>
+      </w:r>
+      <w:r>
+        <w:rPr>
+          <w:rFonts w:cs="Arial" w:hint="cs"/>
+          <w:b/>
+          <w:bCs/>
+          <w:rtl/>
+        </w:rPr>
+        <w:t>מדי</w:t>
+      </w:r>
+      <w:r>
+        <w:rPr>
+          <w:rFonts w:cs="Arial"/>
+          <w:b/>
+          <w:bCs/>
+          <w:rtl/>
+        </w:rPr>
+        <w:t xml:space="preserve"> (</w:t>
+      </w:r>
+      <w:r>
+        <w:rPr>
+          <w:rFonts w:cs="Arial" w:hint="cs"/>
+          <w:b/>
+          <w:bCs/>
+          <w:rtl/>
+        </w:rPr>
+        <w:t>קשוח</w:t>
+      </w:r>
+      <w:r>
+        <w:rPr>
+          <w:rFonts w:cs="Arial"/>
+          <w:b/>
+          <w:bCs/>
+          <w:rtl/>
+        </w:rPr>
+        <w:t xml:space="preserve"> </w:t>
+      </w:r>
+      <w:r>
+        <w:rPr>
+          <w:rFonts w:cs="Arial" w:hint="cs"/>
+          <w:b/>
+          <w:bCs/>
+          <w:rtl/>
+        </w:rPr>
+        <w:t>מדי</w:t>
+      </w:r>
+      <w:r>
+        <w:rPr>
+          <w:rFonts w:cs="Arial"/>
+          <w:b/>
+          <w:bCs/>
+          <w:rtl/>
+        </w:rPr>
+        <w:t xml:space="preserve">). </w:t>
+      </w:r>
+      <w:r>
+        <w:rPr>
+          <w:rFonts w:cs="Arial" w:hint="cs"/>
+          <w:b/>
+          <w:bCs/>
+          <w:rtl/>
+        </w:rPr>
+        <w:t>תגדיל</w:t>
+      </w:r>
+      <w:r>
+        <w:rPr>
+          <w:rFonts w:cs="Arial"/>
+          <w:b/>
+          <w:bCs/>
+          <w:rtl/>
+        </w:rPr>
+        <w:t xml:space="preserve"> </w:t>
+      </w:r>
+      <w:r>
+        <w:rPr>
+          <w:rFonts w:cs="Arial" w:hint="cs"/>
+          <w:b/>
+          <w:bCs/>
+          <w:rtl/>
+        </w:rPr>
+        <w:t>אותו</w:t>
+      </w:r>
+      <w:r>
+        <w:rPr>
+          <w:rFonts w:cs="Arial"/>
+          <w:b/>
+          <w:bCs/>
+          <w:rtl/>
+        </w:rPr>
+        <w:t>.</w:t>
+      </w:r>
+    </w:p>
+    <w:p>
+      <w:pPr>
+        <w:rPr>
+          <w:b/>
+          <w:bCs/>
+          <w:rtl/>
+        </w:rPr>
+      </w:pPr>
+    </w:p>
+    <w:p>
+      <w:pPr>
+        <w:rPr>
+          <w:sz w:val="18"/>
+          <w:szCs w:val="18"/>
+          <w:rtl/>
+        </w:rPr>
+      </w:pPr>
+      <w:r>
+        <w:rPr>
+          <w:rFonts w:cs="Arial"/>
+          <w:sz w:val="18"/>
+          <w:szCs w:val="18"/>
+          <w:rtl/>
+        </w:rPr>
+        <w:t xml:space="preserve">בקוד שלך יש פונקציה </w:t>
+      </w:r>
+      <w:proofErr w:type="spellStart"/>
+      <w:r>
+        <w:rPr>
+          <w:sz w:val="18"/>
+          <w:szCs w:val="18"/>
+        </w:rPr>
+        <w:t>adjust_floor_epsilon</w:t>
+      </w:r>
+      <w:proofErr w:type="spellEnd"/>
+      <w:r>
+        <w:rPr>
+          <w:sz w:val="18"/>
+          <w:szCs w:val="18"/>
+        </w:rPr>
+        <w:t>(delta)</w:t>
+      </w:r>
+      <w:r>
+        <w:rPr>
+          <w:rFonts w:cs="Arial"/>
+          <w:sz w:val="18"/>
+          <w:szCs w:val="18"/>
+          <w:rtl/>
+        </w:rPr>
+        <w:t xml:space="preserve">. בכל פעם שאתה לוחץ על הכפתור, הפונקציה הזו מעדכנת את המשתנה בזיכרון, ומיד קוראת לפונקציה </w:t>
+      </w:r>
+      <w:proofErr w:type="spellStart"/>
+      <w:r>
+        <w:rPr>
+          <w:sz w:val="18"/>
+          <w:szCs w:val="18"/>
+        </w:rPr>
+        <w:t>save_floor_epsilon</w:t>
+      </w:r>
+      <w:proofErr w:type="spellEnd"/>
+      <w:r>
+        <w:rPr>
+          <w:rFonts w:cs="Arial"/>
+          <w:sz w:val="18"/>
+          <w:szCs w:val="18"/>
+          <w:rtl/>
+        </w:rPr>
+        <w:t xml:space="preserve"> שפותחת את קובץ ה-</w:t>
+      </w:r>
+      <w:r>
+        <w:rPr>
+          <w:sz w:val="18"/>
+          <w:szCs w:val="18"/>
+        </w:rPr>
+        <w:t>JSON</w:t>
+      </w:r>
+      <w:r>
+        <w:rPr>
+          <w:rFonts w:cs="Arial"/>
+          <w:sz w:val="18"/>
+          <w:szCs w:val="18"/>
+          <w:rtl/>
+        </w:rPr>
+        <w:t>, כותבת אליו את הערך החדש, וסוגרת. כך, גם אם התוכנה קורסת שנייה אחרי, הערך החדש כבר נשמר בדיסק ויטען מחדש בהפעלה הבאה. הסוכן יוודא שזה מיושם נכון.</w:t>
+      </w:r>
+    </w:p>
+    <w:p>
+      <w:pPr>
+        <w:rPr>
+          <w:sz w:val="18"/>
+          <w:szCs w:val="18"/>
+          <w:rtl/>
+        </w:rPr>
+      </w:pPr>
+    </w:p>
+    <w:p>
+      <w:pPr>
+        <w:rPr>
+          <w:sz w:val="18"/>
+          <w:szCs w:val="18"/>
+          <w:rtl/>
+        </w:rPr>
+      </w:pPr>
+    </w:p>
+    <w:p>
+      <w:pPr>
+        <w:rPr>
+          <w:sz w:val="18"/>
+          <w:szCs w:val="18"/>
+          <w:rtl/>
+        </w:rPr>
+      </w:pPr>
+    </w:p>
+    <w:p>
+      <w:pPr>
+        <w:rPr>
+          <w:b/>
+          <w:bCs/>
+          <w:sz w:val="18"/>
+          <w:szCs w:val="18"/>
+        </w:rPr>
+      </w:pPr>
+    </w:p>
+    <w:p>
+      <w:pPr>
+        <w:rPr>
           <w:rFonts w:hint="cs"/>
           <w:b/>
           <w:bCs/>
         </w:rPr>
       </w:pPr>
-      <w:r>
-        <w:rPr>
-          <w:rFonts w:cs="Arial" w:hint="cs"/>
-          <w:b/>
-          <w:bCs/>
-          <w:rtl/>
-        </w:rPr>
-        <w:t>אם</w:t>
-      </w:r>
-      <w:r>
-        <w:rPr>
-          <w:rFonts w:cs="Arial"/>
-          <w:b/>
-          <w:bCs/>
-          <w:rtl/>
-        </w:rPr>
-        <w:t xml:space="preserve"> </w:t>
-      </w:r>
-      <w:r>
-        <w:rPr>
-          <w:rFonts w:cs="Arial" w:hint="cs"/>
-          <w:b/>
-          <w:bCs/>
-          <w:rtl/>
-        </w:rPr>
-        <w:t>הכדור</w:t>
-      </w:r>
-      <w:r>
-        <w:rPr>
-          <w:rFonts w:cs="Arial"/>
-          <w:b/>
-          <w:bCs/>
-          <w:rtl/>
-        </w:rPr>
-        <w:t xml:space="preserve"> </w:t>
-      </w:r>
-      <w:r>
-        <w:rPr>
-          <w:rFonts w:cs="Arial" w:hint="cs"/>
-          <w:b/>
-          <w:bCs/>
-          <w:rtl/>
-        </w:rPr>
-        <w:t>נופל</w:t>
-      </w:r>
-      <w:r>
-        <w:rPr>
-          <w:rFonts w:cs="Arial"/>
-          <w:b/>
-          <w:bCs/>
-          <w:rtl/>
-        </w:rPr>
-        <w:t xml:space="preserve"> </w:t>
-      </w:r>
-      <w:r>
-        <w:rPr>
-          <w:rFonts w:cs="Arial" w:hint="cs"/>
-          <w:b/>
-          <w:bCs/>
-          <w:rtl/>
-        </w:rPr>
-        <w:t>לרצפה</w:t>
-      </w:r>
-      <w:r>
-        <w:rPr>
-          <w:rFonts w:cs="Arial"/>
-          <w:b/>
-          <w:bCs/>
-          <w:rtl/>
-        </w:rPr>
-        <w:t xml:space="preserve"> </w:t>
-      </w:r>
-      <w:r>
-        <w:rPr>
-          <w:rFonts w:cs="Arial" w:hint="cs"/>
-          <w:b/>
-          <w:bCs/>
-          <w:rtl/>
-        </w:rPr>
-        <w:t>והמשחק</w:t>
-      </w:r>
-      <w:r>
-        <w:rPr>
-          <w:rFonts w:cs="Arial"/>
-          <w:b/>
-          <w:bCs/>
-          <w:rtl/>
-        </w:rPr>
-        <w:t xml:space="preserve"> </w:t>
-      </w:r>
-      <w:r>
-        <w:rPr>
-          <w:rFonts w:cs="Arial" w:hint="cs"/>
-          <w:b/>
-          <w:bCs/>
-          <w:rtl/>
-        </w:rPr>
-        <w:t>ממשיך</w:t>
-      </w:r>
-      <w:r>
-        <w:rPr>
-          <w:rFonts w:cs="Arial"/>
-          <w:b/>
-          <w:bCs/>
-          <w:rtl/>
-        </w:rPr>
-        <w:t xml:space="preserve"> </w:t>
-      </w:r>
-      <w:r>
-        <w:rPr>
-          <w:rFonts w:cs="Arial" w:hint="cs"/>
-          <w:b/>
-          <w:bCs/>
-          <w:rtl/>
-        </w:rPr>
-        <w:t>כאילו</w:t>
-      </w:r>
-      <w:r>
-        <w:rPr>
-          <w:rFonts w:cs="Arial"/>
-          <w:b/>
-          <w:bCs/>
-          <w:rtl/>
-        </w:rPr>
-        <w:t xml:space="preserve"> </w:t>
-      </w:r>
-      <w:r>
-        <w:rPr>
-          <w:rFonts w:cs="Arial" w:hint="cs"/>
-          <w:b/>
-          <w:bCs/>
-          <w:rtl/>
-        </w:rPr>
-        <w:t>כלום</w:t>
-      </w:r>
-      <w:r>
-        <w:rPr>
-          <w:rFonts w:cs="Arial"/>
-          <w:b/>
-          <w:bCs/>
-          <w:rtl/>
-        </w:rPr>
-        <w:t xml:space="preserve"> </w:t>
-      </w:r>
-      <w:r>
-        <w:rPr>
-          <w:rFonts w:cs="Arial" w:hint="cs"/>
-          <w:b/>
-          <w:bCs/>
-          <w:rtl/>
-        </w:rPr>
-        <w:t>לא</w:t>
-      </w:r>
-      <w:r>
-        <w:rPr>
-          <w:rFonts w:cs="Arial"/>
-          <w:b/>
-          <w:bCs/>
-          <w:rtl/>
-        </w:rPr>
-        <w:t xml:space="preserve"> </w:t>
-      </w:r>
-      <w:r>
-        <w:rPr>
-          <w:rFonts w:cs="Arial" w:hint="cs"/>
-          <w:b/>
-          <w:bCs/>
-          <w:rtl/>
-        </w:rPr>
-        <w:t>קרה</w:t>
-      </w:r>
-      <w:r>
-        <w:rPr>
-          <w:rFonts w:cs="Arial"/>
-          <w:b/>
-          <w:bCs/>
-          <w:rtl/>
-        </w:rPr>
-        <w:t xml:space="preserve"> -&gt; </w:t>
-      </w:r>
-      <w:r>
-        <w:rPr>
-          <w:rFonts w:cs="Arial" w:hint="cs"/>
-          <w:b/>
-          <w:bCs/>
-          <w:rtl/>
-        </w:rPr>
-        <w:t>סימן</w:t>
-      </w:r>
-      <w:r>
-        <w:rPr>
-          <w:rFonts w:cs="Arial"/>
-          <w:b/>
-          <w:bCs/>
-          <w:rtl/>
-        </w:rPr>
-        <w:t xml:space="preserve"> </w:t>
-      </w:r>
-      <w:r>
-        <w:rPr>
-          <w:rFonts w:cs="Arial" w:hint="cs"/>
-          <w:b/>
-          <w:bCs/>
-          <w:rtl/>
-        </w:rPr>
-        <w:t>שהאפסילון</w:t>
-      </w:r>
-      <w:r>
-        <w:rPr>
-          <w:rFonts w:cs="Arial"/>
-          <w:b/>
-          <w:bCs/>
-          <w:rtl/>
-        </w:rPr>
-        <w:t xml:space="preserve"> </w:t>
-      </w:r>
-      <w:r>
-        <w:rPr>
-          <w:rFonts w:cs="Arial" w:hint="cs"/>
-          <w:b/>
-          <w:bCs/>
-          <w:rtl/>
-        </w:rPr>
-        <w:t>קטן</w:t>
-      </w:r>
-      <w:r>
-        <w:rPr>
-          <w:rFonts w:cs="Arial"/>
-          <w:b/>
-          <w:bCs/>
-          <w:rtl/>
-        </w:rPr>
-        <w:t xml:space="preserve"> </w:t>
-      </w:r>
-      <w:r>
-        <w:rPr>
-          <w:rFonts w:cs="Arial" w:hint="cs"/>
-          <w:b/>
-          <w:bCs/>
-          <w:rtl/>
-        </w:rPr>
-        <w:t>מדי</w:t>
-      </w:r>
-      <w:r>
-        <w:rPr>
-          <w:rFonts w:cs="Arial"/>
-          <w:b/>
-          <w:bCs/>
-          <w:rtl/>
-        </w:rPr>
-        <w:t xml:space="preserve"> (</w:t>
-      </w:r>
-      <w:r>
-        <w:rPr>
-          <w:rFonts w:cs="Arial" w:hint="cs"/>
-          <w:b/>
-          <w:bCs/>
-          <w:rtl/>
-        </w:rPr>
-        <w:t>קשוח</w:t>
-      </w:r>
-      <w:r>
-        <w:rPr>
-          <w:rFonts w:cs="Arial"/>
-          <w:b/>
-          <w:bCs/>
-          <w:rtl/>
-        </w:rPr>
-        <w:t xml:space="preserve"> </w:t>
-      </w:r>
-      <w:r>
-        <w:rPr>
-          <w:rFonts w:cs="Arial" w:hint="cs"/>
-          <w:b/>
-          <w:bCs/>
-          <w:rtl/>
-        </w:rPr>
-        <w:t>מדי</w:t>
-      </w:r>
-      <w:r>
-        <w:rPr>
-          <w:rFonts w:cs="Arial"/>
-          <w:b/>
-          <w:bCs/>
-          <w:rtl/>
-        </w:rPr>
-        <w:t xml:space="preserve">). </w:t>
-      </w:r>
-      <w:r>
-        <w:rPr>
-          <w:rFonts w:cs="Arial" w:hint="cs"/>
-          <w:b/>
-          <w:bCs/>
-          <w:rtl/>
-        </w:rPr>
-        <w:t>תגדיל</w:t>
-      </w:r>
-      <w:r>
-        <w:rPr>
-          <w:rFonts w:cs="Arial"/>
-          <w:b/>
-          <w:bCs/>
-          <w:rtl/>
-        </w:rPr>
-        <w:t xml:space="preserve"> </w:t>
-      </w:r>
-      <w:r>
-        <w:rPr>
-          <w:rFonts w:cs="Arial" w:hint="cs"/>
-          <w:b/>
-          <w:bCs/>
-          <w:rtl/>
-        </w:rPr>
-        <w:t>אותו</w:t>
-      </w:r>
-      <w:r>
-        <w:rPr>
-          <w:rFonts w:cs="Arial"/>
-          <w:b/>
-          <w:bCs/>
-          <w:rtl/>
-        </w:rPr>
-        <w:t>.</w:t>
-      </w:r>
     </w:p>
     <w:sectPr>
       <w:pgSz w:w="11906" w:h="16838"/>
@@ -7584,6 +7716,304 @@
       </w:rPr>
     </w:lvl>
   </w:abstractNum>
+  <w:abstractNum w:abstractNumId="4" w15:restartNumberingAfterBreak="0">
+    <w:nsid w:val="473B533D"/>
+    <w:multiLevelType w:val="multilevel"/>
+    <w:tmpl w:val="1F30ED4E"/>
+    <w:lvl w:ilvl="0">
+      <w:start w:val="1"/>
+      <w:numFmt w:val="bullet"/>
+      <w:lvlText w:val=""/>
+      <w:lvlJc w:val="left"/>
+      <w:pPr>
+        <w:tabs>
+          <w:tab w:val="num" w:pos="720"/>
+        </w:tabs>
+        <w:ind w:left="720" w:hanging="360"/>
+      </w:pPr>
+      <w:rPr>
+        <w:rFonts w:ascii="Symbol" w:hAnsi="Symbol" w:hint="default"/>
+        <w:sz w:val="20"/>
+      </w:rPr>
+    </w:lvl>
+    <w:lvl w:ilvl="1" w:tentative="1">
+      <w:start w:val="1"/>
+      <w:numFmt w:val="bullet"/>
+      <w:lvlText w:val="o"/>
+      <w:lvlJc w:val="left"/>
+      <w:pPr>
+        <w:tabs>
+          <w:tab w:val="num" w:pos="1440"/>
+        </w:tabs>
+        <w:ind w:left="1440" w:hanging="360"/>
+      </w:pPr>
+      <w:rPr>
+        <w:rFonts w:ascii="Courier New" w:hAnsi="Courier New" w:hint="default"/>
+        <w:sz w:val="20"/>
+      </w:rPr>
+    </w:lvl>
+    <w:lvl w:ilvl="2" w:tentative="1">
+      <w:start w:val="1"/>
+      <w:numFmt w:val="bullet"/>
+      <w:lvlText w:val=""/>
+      <w:lvlJc w:val="left"/>
+      <w:pPr>
+        <w:tabs>
+          <w:tab w:val="num" w:pos="2160"/>
+        </w:tabs>
+        <w:ind w:left="2160" w:hanging="360"/>
+      </w:pPr>
+      <w:rPr>
+        <w:rFonts w:ascii="Wingdings" w:hAnsi="Wingdings" w:hint="default"/>
+        <w:sz w:val="20"/>
+      </w:rPr>
+    </w:lvl>
+    <w:lvl w:ilvl="3" w:tentative="1">
+      <w:start w:val="1"/>
+      <w:numFmt w:val="bullet"/>
+      <w:lvlText w:val=""/>
+      <w:lvlJc w:val="left"/>
+      <w:pPr>
+        <w:tabs>
+          <w:tab w:val="num" w:pos="2880"/>
+        </w:tabs>
+        <w:ind w:left="2880" w:hanging="360"/>
+      </w:pPr>
+      <w:rPr>
+        <w:rFonts w:ascii="Wingdings" w:hAnsi="Wingdings" w:hint="default"/>
+        <w:sz w:val="20"/>
+      </w:rPr>
+    </w:lvl>
+    <w:lvl w:ilvl="4" w:tentative="1">
+      <w:start w:val="1"/>
+      <w:numFmt w:val="bullet"/>
+      <w:lvlText w:val=""/>
+      <w:lvlJc w:val="left"/>
+      <w:pPr>
+        <w:tabs>
+          <w:tab w:val="num" w:pos="3600"/>
+        </w:tabs>
+        <w:ind w:left="3600" w:hanging="360"/>
+      </w:pPr>
+      <w:rPr>
+        <w:rFonts w:ascii="Wingdings" w:hAnsi="Wingdings" w:hint="default"/>
+        <w:sz w:val="20"/>
+      </w:rPr>
+    </w:lvl>
+    <w:lvl w:ilvl="5" w:tentative="1">
+      <w:start w:val="1"/>
+      <w:numFmt w:val="bullet"/>
+      <w:lvlText w:val=""/>
+      <w:lvlJc w:val="left"/>
+      <w:pPr>
+        <w:tabs>
+          <w:tab w:val="num" w:pos="4320"/>
+        </w:tabs>
+        <w:ind w:left="4320" w:hanging="360"/>
+      </w:pPr>
+      <w:rPr>
+        <w:rFonts w:ascii="Wingdings" w:hAnsi="Wingdings" w:hint="default"/>
+        <w:sz w:val="20"/>
+      </w:rPr>
+    </w:lvl>
+    <w:lvl w:ilvl="6" w:tentative="1">
+      <w:start w:val="1"/>
+      <w:numFmt w:val="bullet"/>
+      <w:lvlText w:val=""/>
+      <w:lvlJc w:val="left"/>
+      <w:pPr>
+        <w:tabs>
+          <w:tab w:val="num" w:pos="5040"/>
+        </w:tabs>
+        <w:ind w:left="5040" w:hanging="360"/>
+      </w:pPr>
+      <w:rPr>
+        <w:rFonts w:ascii="Wingdings" w:hAnsi="Wingdings" w:hint="default"/>
+        <w:sz w:val="20"/>
+      </w:rPr>
+    </w:lvl>
+    <w:lvl w:ilvl="7" w:tentative="1">
+      <w:start w:val="1"/>
+      <w:numFmt w:val="bullet"/>
+      <w:lvlText w:val=""/>
+      <w:lvlJc w:val="left"/>
+      <w:pPr>
+        <w:tabs>
+          <w:tab w:val="num" w:pos="5760"/>
+        </w:tabs>
+        <w:ind w:left="5760" w:hanging="360"/>
+      </w:pPr>
+      <w:rPr>
+        <w:rFonts w:ascii="Wingdings" w:hAnsi="Wingdings" w:hint="default"/>
+        <w:sz w:val="20"/>
+      </w:rPr>
+    </w:lvl>
+    <w:lvl w:ilvl="8" w:tentative="1">
+      <w:start w:val="1"/>
+      <w:numFmt w:val="bullet"/>
+      <w:lvlText w:val=""/>
+      <w:lvlJc w:val="left"/>
+      <w:pPr>
+        <w:tabs>
+          <w:tab w:val="num" w:pos="6480"/>
+        </w:tabs>
+        <w:ind w:left="6480" w:hanging="360"/>
+      </w:pPr>
+      <w:rPr>
+        <w:rFonts w:ascii="Wingdings" w:hAnsi="Wingdings" w:hint="default"/>
+        <w:sz w:val="20"/>
+      </w:rPr>
+    </w:lvl>
+  </w:abstractNum>
+  <w:abstractNum w:abstractNumId="5" w15:restartNumberingAfterBreak="0">
+    <w:nsid w:val="62B44E2D"/>
+    <w:multiLevelType w:val="multilevel"/>
+    <w:tmpl w:val="BADAB122"/>
+    <w:lvl w:ilvl="0">
+      <w:start w:val="1"/>
+      <w:numFmt w:val="bullet"/>
+      <w:lvlText w:val=""/>
+      <w:lvlJc w:val="left"/>
+      <w:pPr>
+        <w:tabs>
+          <w:tab w:val="num" w:pos="720"/>
+        </w:tabs>
+        <w:ind w:left="720" w:hanging="360"/>
+      </w:pPr>
+      <w:rPr>
+        <w:rFonts w:ascii="Symbol" w:hAnsi="Symbol" w:hint="default"/>
+        <w:sz w:val="20"/>
+      </w:rPr>
+    </w:lvl>
+    <w:lvl w:ilvl="1" w:tentative="1">
+      <w:start w:val="1"/>
+      <w:numFmt w:val="bullet"/>
+      <w:lvlText w:val="o"/>
+      <w:lvlJc w:val="left"/>
+      <w:pPr>
+        <w:tabs>
+          <w:tab w:val="num" w:pos="1440"/>
+        </w:tabs>
+        <w:ind w:left="1440" w:hanging="360"/>
+      </w:pPr>
+      <w:rPr>
+        <w:rFonts w:ascii="Courier New" w:hAnsi="Courier New" w:hint="default"/>
+        <w:sz w:val="20"/>
+      </w:rPr>
+    </w:lvl>
+    <w:lvl w:ilvl="2" w:tentative="1">
+      <w:start w:val="1"/>
+      <w:numFmt w:val="bullet"/>
+      <w:lvlText w:val=""/>
+      <w:lvlJc w:val="left"/>
+      <w:pPr>
+        <w:tabs>
+          <w:tab w:val="num" w:pos="2160"/>
+        </w:tabs>
+        <w:ind w:left="2160" w:hanging="360"/>
+      </w:pPr>
+      <w:rPr>
+        <w:rFonts w:ascii="Wingdings" w:hAnsi="Wingdings" w:hint="default"/>
+        <w:sz w:val="20"/>
+      </w:rPr>
+    </w:lvl>
+    <w:lvl w:ilvl="3" w:tentative="1">
+      <w:start w:val="1"/>
+      <w:numFmt w:val="bullet"/>
+      <w:lvlText w:val=""/>
+      <w:lvlJc w:val="left"/>
+      <w:pPr>
+        <w:tabs>
+          <w:tab w:val="num" w:pos="2880"/>
+        </w:tabs>
+        <w:ind w:left="2880" w:hanging="360"/>
+      </w:pPr>
+      <w:rPr>
+        <w:rFonts w:ascii="Wingdings" w:hAnsi="Wingdings" w:hint="default"/>
+        <w:sz w:val="20"/>
+      </w:rPr>
+    </w:lvl>
+    <w:lvl w:ilvl="4" w:tentative="1">
+      <w:start w:val="1"/>
+      <w:numFmt w:val="bullet"/>
+      <w:lvlText w:val=""/>
+      <w:lvlJc w:val="left"/>
+      <w:pPr>
+        <w:tabs>
+          <w:tab w:val="num" w:pos="3600"/>
+        </w:tabs>
+        <w:ind w:left="3600" w:hanging="360"/>
+      </w:pPr>
+      <w:rPr>
+        <w:rFonts w:ascii="Wingdings" w:hAnsi="Wingdings" w:hint="default"/>
+        <w:sz w:val="20"/>
+      </w:rPr>
+    </w:lvl>
+    <w:lvl w:ilvl="5" w:tentative="1">
+      <w:start w:val="1"/>
+      <w:numFmt w:val="bullet"/>
+      <w:lvlText w:val=""/>
+      <w:lvlJc w:val="left"/>
+      <w:pPr>
+        <w:tabs>
+          <w:tab w:val="num" w:pos="4320"/>
+        </w:tabs>
+        <w:ind w:left="4320" w:hanging="360"/>
+      </w:pPr>
+      <w:rPr>
+        <w:rFonts w:ascii="Wingdings" w:hAnsi="Wingdings" w:hint="default"/>
+        <w:sz w:val="20"/>
+      </w:rPr>
+    </w:lvl>
+    <w:lvl w:ilvl="6" w:tentative="1">
+      <w:start w:val="1"/>
+      <w:numFmt w:val="bullet"/>
+      <w:lvlText w:val=""/>
+      <w:lvlJc w:val="left"/>
+      <w:pPr>
+        <w:tabs>
+          <w:tab w:val="num" w:pos="5040"/>
+        </w:tabs>
+        <w:ind w:left="5040" w:hanging="360"/>
+      </w:pPr>
+      <w:rPr>
+        <w:rFonts w:ascii="Wingdings" w:hAnsi="Wingdings" w:hint="default"/>
+        <w:sz w:val="20"/>
+      </w:rPr>
+    </w:lvl>
+    <w:lvl w:ilvl="7" w:tentative="1">
+      <w:start w:val="1"/>
+      <w:numFmt w:val="bullet"/>
+      <w:lvlText w:val=""/>
+      <w:lvlJc w:val="left"/>
+      <w:pPr>
+        <w:tabs>
+          <w:tab w:val="num" w:pos="5760"/>
+        </w:tabs>
+        <w:ind w:left="5760" w:hanging="360"/>
+      </w:pPr>
+      <w:rPr>
+        <w:rFonts w:ascii="Wingdings" w:hAnsi="Wingdings" w:hint="default"/>
+        <w:sz w:val="20"/>
+      </w:rPr>
+    </w:lvl>
+    <w:lvl w:ilvl="8" w:tentative="1">
+      <w:start w:val="1"/>
+      <w:numFmt w:val="bullet"/>
+      <w:lvlText w:val=""/>
+      <w:lvlJc w:val="left"/>
+      <w:pPr>
+        <w:tabs>
+          <w:tab w:val="num" w:pos="6480"/>
+        </w:tabs>
+        <w:ind w:left="6480" w:hanging="360"/>
+      </w:pPr>
+      <w:rPr>
+        <w:rFonts w:ascii="Wingdings" w:hAnsi="Wingdings" w:hint="default"/>
+        <w:sz w:val="20"/>
+      </w:rPr>
+    </w:lvl>
+  </w:abstractNum>
   <w:num w:numId="1" w16cid:durableId="671683354">
     <w:abstractNumId w:val="0"/>
   </w:num>
@@ -7595,6 +8025,12 @@
   </w:num>
   <w:num w:numId="4" w16cid:durableId="1502699826">
     <w:abstractNumId w:val="1"/>
+  </w:num>
+  <w:num w:numId="5" w16cid:durableId="987250477">
+    <w:abstractNumId w:val="4"/>
+  </w:num>
+  <w:num w:numId="6" w16cid:durableId="1750613914">
+    <w:abstractNumId w:val="5"/>
   </w:num>
 </w:numbering>
 </file>
@@ -8514,6 +8950,29 @@
       <w:spacing w:val="5"/>
     </w:rPr>
   </w:style>
+  <w:style w:type="character" w:styleId="Hyperlink">
+    <w:name w:val="Hyperlink"/>
+    <w:basedOn w:val="a0"/>
+    <w:uiPriority w:val="99"/>
+    <w:unhideWhenUsed/>
+    <w:rsid w:val="00023D24"/>
+    <w:rPr>
+      <w:color w:val="467886" w:themeColor="hyperlink"/>
+      <w:u w:val="single"/>
+    </w:rPr>
+  </w:style>
+  <w:style w:type="character" w:styleId="ae">
+    <w:name w:val="Unresolved Mention"/>
+    <w:basedOn w:val="a0"/>
+    <w:uiPriority w:val="99"/>
+    <w:semiHidden/>
+    <w:unhideWhenUsed/>
+    <w:rsid w:val="00023D24"/>
+    <w:rPr>
+      <w:color w:val="605E5C"/>
+      <w:shd w:val="clear" w:color="auto" w:fill="E1DFDD"/>
+    </w:rPr>
+  </w:style>
 </w:styles>
 </file>
 

</xml_diff>